<commit_message>
feat(sprint-6): cierre Sprint 6 – backend completo y operativo
</commit_message>
<xml_diff>
--- a/docs/Sprints/02 - Sprint 6 ES.docx
+++ b/docs/Sprints/02 - Sprint 6 ES.docx
@@ -41,8 +41,18 @@
           <w:bCs/>
           <w:lang w:val="en-US"/>
         </w:rPr>
-        <w:t>TECHNOTON — FitFlow</w:t>
-      </w:r>
+        <w:t xml:space="preserve">TECHNOTON — </w:t>
+      </w:r>
+      <w:proofErr w:type="spellStart"/>
+      <w:r>
+        <w:rPr>
+          <w:b/>
+          <w:bCs/>
+          <w:lang w:val="en-US"/>
+        </w:rPr>
+        <w:t>FitFlow</w:t>
+      </w:r>
+      <w:proofErr w:type="spellEnd"/>
     </w:p>
     <w:p>
       <w:pPr>
@@ -68,6 +78,7 @@
           <w:bCs/>
         </w:rPr>
       </w:pPr>
+      <w:proofErr w:type="spellStart"/>
       <w:r>
         <w:rPr>
           <w:b/>
@@ -75,7 +86,37 @@
           <w:i/>
           <w:iCs/>
         </w:rPr>
-        <w:t>Build. Scale. Automate.</w:t>
+        <w:t>Build</w:t>
+      </w:r>
+      <w:proofErr w:type="spellEnd"/>
+      <w:r>
+        <w:rPr>
+          <w:b/>
+          <w:bCs/>
+          <w:i/>
+          <w:iCs/>
+        </w:rPr>
+        <w:t xml:space="preserve">. Scale. </w:t>
+      </w:r>
+      <w:proofErr w:type="spellStart"/>
+      <w:r>
+        <w:rPr>
+          <w:b/>
+          <w:bCs/>
+          <w:i/>
+          <w:iCs/>
+        </w:rPr>
+        <w:t>Automate</w:t>
+      </w:r>
+      <w:proofErr w:type="spellEnd"/>
+      <w:r>
+        <w:rPr>
+          <w:b/>
+          <w:bCs/>
+          <w:i/>
+          <w:iCs/>
+        </w:rPr>
+        <w:t>.</w:t>
       </w:r>
     </w:p>
     <w:p>
@@ -112,7 +153,15 @@
         <w:t>Proyecto:</w:t>
       </w:r>
       <w:r>
-        <w:t xml:space="preserve"> FitFlow – Sistema de Gestión de Gimnasio </w:t>
+        <w:t xml:space="preserve"> </w:t>
+      </w:r>
+      <w:proofErr w:type="spellStart"/>
+      <w:r>
+        <w:t>FitFlow</w:t>
+      </w:r>
+      <w:proofErr w:type="spellEnd"/>
+      <w:r>
+        <w:t xml:space="preserve"> – Sistema de Gestión de Gimnasio </w:t>
       </w:r>
       <w:r>
         <w:rPr>
@@ -132,8 +181,13 @@
         <w:t>Autor:</w:t>
       </w:r>
       <w:r>
-        <w:t xml:space="preserve"> Technoton</w:t>
-      </w:r>
+        <w:t xml:space="preserve"> </w:t>
+      </w:r>
+      <w:proofErr w:type="spellStart"/>
+      <w:r>
+        <w:t>Technoton</w:t>
+      </w:r>
+      <w:proofErr w:type="spellEnd"/>
     </w:p>
     <w:p>
       <w:r>
@@ -161,7 +215,15 @@
     </w:p>
     <w:p>
       <w:r>
-        <w:t>El Sprint 6 expande las capacidades del sistema FitFlow incorporando:</w:t>
+        <w:t xml:space="preserve">El Sprint 6 expande las capacidades del sistema </w:t>
+      </w:r>
+      <w:proofErr w:type="spellStart"/>
+      <w:r>
+        <w:t>FitFlow</w:t>
+      </w:r>
+      <w:proofErr w:type="spellEnd"/>
+      <w:r>
+        <w:t xml:space="preserve"> incorporando:</w:t>
       </w:r>
     </w:p>
     <w:p>
@@ -172,8 +234,13 @@
         </w:numPr>
       </w:pPr>
       <w:r>
-        <w:t>CRUD completo de clases desde frontend</w:t>
-      </w:r>
+        <w:t xml:space="preserve">CRUD completo de clases desde </w:t>
+      </w:r>
+      <w:proofErr w:type="spellStart"/>
+      <w:r>
+        <w:t>frontend</w:t>
+      </w:r>
+      <w:proofErr w:type="spellEnd"/>
     </w:p>
     <w:p>
       <w:pPr>
@@ -183,7 +250,15 @@
         </w:numPr>
       </w:pPr>
       <w:r>
-        <w:t>Pantalla CRUD de ClassSchedule (agenda semanal)</w:t>
+        <w:t xml:space="preserve">Pantalla CRUD de </w:t>
+      </w:r>
+      <w:proofErr w:type="spellStart"/>
+      <w:r>
+        <w:t>ClassSchedule</w:t>
+      </w:r>
+      <w:proofErr w:type="spellEnd"/>
+      <w:r>
+        <w:t xml:space="preserve"> (agenda semanal)</w:t>
       </w:r>
     </w:p>
     <w:p>
@@ -194,7 +269,15 @@
         </w:numPr>
       </w:pPr>
       <w:r>
-        <w:t>Pantalla CRUD de ClassSession (sesiones generadas)</w:t>
+        <w:t xml:space="preserve">Pantalla CRUD de </w:t>
+      </w:r>
+      <w:proofErr w:type="spellStart"/>
+      <w:r>
+        <w:t>ClassSession</w:t>
+      </w:r>
+      <w:proofErr w:type="spellEnd"/>
+      <w:r>
+        <w:t xml:space="preserve"> (sesiones generadas)</w:t>
       </w:r>
     </w:p>
     <w:p>
@@ -207,6 +290,7 @@
       <w:r>
         <w:t xml:space="preserve">Integración del rol </w:t>
       </w:r>
+      <w:proofErr w:type="spellStart"/>
       <w:r>
         <w:rPr>
           <w:b/>
@@ -214,6 +298,7 @@
         </w:rPr>
         <w:t>front_desk</w:t>
       </w:r>
+      <w:proofErr w:type="spellEnd"/>
     </w:p>
     <w:p>
       <w:pPr>
@@ -223,7 +308,15 @@
         </w:numPr>
       </w:pPr>
       <w:r>
-        <w:t>Ajustes en endpoints y modelos</w:t>
+        <w:t xml:space="preserve">Ajustes en </w:t>
+      </w:r>
+      <w:proofErr w:type="spellStart"/>
+      <w:r>
+        <w:t>endpoints</w:t>
+      </w:r>
+      <w:proofErr w:type="spellEnd"/>
+      <w:r>
+        <w:t xml:space="preserve"> y modelos</w:t>
       </w:r>
     </w:p>
     <w:p>
@@ -244,8 +337,13 @@
           <w:numId w:val="1"/>
         </w:numPr>
       </w:pPr>
-      <w:r>
-        <w:t>Refactor general para preparar MVP</w:t>
+      <w:proofErr w:type="spellStart"/>
+      <w:r>
+        <w:t>Refactor</w:t>
+      </w:r>
+      <w:proofErr w:type="spellEnd"/>
+      <w:r>
+        <w:t xml:space="preserve"> general para preparar MVP</w:t>
       </w:r>
     </w:p>
     <w:p>
@@ -321,8 +419,21 @@
         </w:numPr>
       </w:pPr>
       <w:r>
-        <w:t>CRUD de GymClass desde frontend</w:t>
-      </w:r>
+        <w:t xml:space="preserve">CRUD de </w:t>
+      </w:r>
+      <w:proofErr w:type="spellStart"/>
+      <w:r>
+        <w:t>GymClass</w:t>
+      </w:r>
+      <w:proofErr w:type="spellEnd"/>
+      <w:r>
+        <w:t xml:space="preserve"> desde </w:t>
+      </w:r>
+      <w:proofErr w:type="spellStart"/>
+      <w:r>
+        <w:t>frontend</w:t>
+      </w:r>
+      <w:proofErr w:type="spellEnd"/>
     </w:p>
     <w:p>
       <w:pPr>
@@ -332,8 +443,13 @@
         </w:numPr>
       </w:pPr>
       <w:r>
-        <w:t>CRUD de ClassSchedule</w:t>
-      </w:r>
+        <w:t xml:space="preserve">CRUD de </w:t>
+      </w:r>
+      <w:proofErr w:type="spellStart"/>
+      <w:r>
+        <w:t>ClassSchedule</w:t>
+      </w:r>
+      <w:proofErr w:type="spellEnd"/>
     </w:p>
     <w:p>
       <w:pPr>
@@ -343,8 +459,13 @@
         </w:numPr>
       </w:pPr>
       <w:r>
-        <w:t>CRUD de ClassSession</w:t>
-      </w:r>
+        <w:t xml:space="preserve">CRUD de </w:t>
+      </w:r>
+      <w:proofErr w:type="spellStart"/>
+      <w:r>
+        <w:t>ClassSession</w:t>
+      </w:r>
+      <w:proofErr w:type="spellEnd"/>
     </w:p>
     <w:p>
       <w:pPr>
@@ -354,8 +475,13 @@
         </w:numPr>
       </w:pPr>
       <w:r>
-        <w:t>Integración del rol front_desk</w:t>
-      </w:r>
+        <w:t xml:space="preserve">Integración del rol </w:t>
+      </w:r>
+      <w:proofErr w:type="spellStart"/>
+      <w:r>
+        <w:t>front_desk</w:t>
+      </w:r>
+      <w:proofErr w:type="spellEnd"/>
     </w:p>
     <w:p>
       <w:pPr>
@@ -365,7 +491,15 @@
         </w:numPr>
       </w:pPr>
       <w:r>
-        <w:t>Ajustes en backend (servicios, modelos, validaciones)</w:t>
+        <w:t xml:space="preserve">Ajustes en </w:t>
+      </w:r>
+      <w:proofErr w:type="spellStart"/>
+      <w:r>
+        <w:t>backend</w:t>
+      </w:r>
+      <w:proofErr w:type="spellEnd"/>
+      <w:r>
+        <w:t xml:space="preserve"> (servicios, modelos, validaciones)</w:t>
       </w:r>
     </w:p>
     <w:p>
@@ -375,8 +509,21 @@
           <w:numId w:val="2"/>
         </w:numPr>
       </w:pPr>
-      <w:r>
-        <w:t>Refactor de frontend para soportar nuevos flujos</w:t>
+      <w:proofErr w:type="spellStart"/>
+      <w:r>
+        <w:t>Refactor</w:t>
+      </w:r>
+      <w:proofErr w:type="spellEnd"/>
+      <w:r>
+        <w:t xml:space="preserve"> de </w:t>
+      </w:r>
+      <w:proofErr w:type="spellStart"/>
+      <w:r>
+        <w:t>frontend</w:t>
+      </w:r>
+      <w:proofErr w:type="spellEnd"/>
+      <w:r>
+        <w:t xml:space="preserve"> para soportar nuevos flujos</w:t>
       </w:r>
     </w:p>
     <w:p>
@@ -387,7 +534,15 @@
         </w:numPr>
       </w:pPr>
       <w:r>
-        <w:t>Revisión de endpoints existentes</w:t>
+        <w:t xml:space="preserve">Revisión de </w:t>
+      </w:r>
+      <w:proofErr w:type="spellStart"/>
+      <w:r>
+        <w:t>endpoints</w:t>
+      </w:r>
+      <w:proofErr w:type="spellEnd"/>
+      <w:r>
+        <w:t xml:space="preserve"> existentes</w:t>
       </w:r>
     </w:p>
     <w:p>
@@ -424,8 +579,13 @@
           <w:numId w:val="3"/>
         </w:numPr>
       </w:pPr>
-      <w:r>
-        <w:t>Testing avanzado</w:t>
+      <w:proofErr w:type="spellStart"/>
+      <w:r>
+        <w:t>Testing</w:t>
+      </w:r>
+      <w:proofErr w:type="spellEnd"/>
+      <w:r>
+        <w:t xml:space="preserve"> avanzado</w:t>
       </w:r>
     </w:p>
     <w:p>
@@ -477,8 +637,17 @@
           <w:b/>
           <w:bCs/>
         </w:rPr>
-        <w:t>HU-601 – CRUD de Clases desde Frontend</w:t>
-      </w:r>
+        <w:t xml:space="preserve">HU-601 – CRUD de Clases desde </w:t>
+      </w:r>
+      <w:proofErr w:type="spellStart"/>
+      <w:r>
+        <w:rPr>
+          <w:b/>
+          <w:bCs/>
+        </w:rPr>
+        <w:t>Frontend</w:t>
+      </w:r>
+      <w:proofErr w:type="spellEnd"/>
     </w:p>
     <w:p>
       <w:r>
@@ -551,8 +720,13 @@
         </w:numPr>
       </w:pPr>
       <w:r>
-        <w:t>Integración con backend</w:t>
-      </w:r>
+        <w:t xml:space="preserve">Integración con </w:t>
+      </w:r>
+      <w:proofErr w:type="spellStart"/>
+      <w:r>
+        <w:t>backend</w:t>
+      </w:r>
+      <w:proofErr w:type="spellEnd"/>
     </w:p>
     <w:p>
       <w:pPr>
@@ -561,8 +735,13 @@
           <w:numId w:val="4"/>
         </w:numPr>
       </w:pPr>
-      <w:r>
-        <w:t>Feedback visual</w:t>
+      <w:proofErr w:type="spellStart"/>
+      <w:r>
+        <w:t>Feedback</w:t>
+      </w:r>
+      <w:proofErr w:type="spellEnd"/>
+      <w:r>
+        <w:t xml:space="preserve"> visual</w:t>
       </w:r>
     </w:p>
     <w:p>
@@ -589,7 +768,15 @@
         <w:t>Como</w:t>
       </w:r>
       <w:r>
-        <w:t xml:space="preserve"> profesor o admin </w:t>
+        <w:t xml:space="preserve"> profesor o </w:t>
+      </w:r>
+      <w:proofErr w:type="spellStart"/>
+      <w:r>
+        <w:t>admin</w:t>
+      </w:r>
+      <w:proofErr w:type="spellEnd"/>
+      <w:r>
+        <w:t xml:space="preserve"> </w:t>
       </w:r>
       <w:r>
         <w:rPr>
@@ -689,7 +876,15 @@
         <w:t>Como</w:t>
       </w:r>
       <w:r>
-        <w:t xml:space="preserve"> front_desk </w:t>
+        <w:t xml:space="preserve"> </w:t>
+      </w:r>
+      <w:proofErr w:type="spellStart"/>
+      <w:r>
+        <w:t>front_desk</w:t>
+      </w:r>
+      <w:proofErr w:type="spellEnd"/>
+      <w:r>
+        <w:t xml:space="preserve"> </w:t>
       </w:r>
       <w:r>
         <w:rPr>
@@ -789,7 +984,15 @@
         <w:t>Como</w:t>
       </w:r>
       <w:r>
-        <w:t xml:space="preserve"> front_desk </w:t>
+        <w:t xml:space="preserve"> </w:t>
+      </w:r>
+      <w:proofErr w:type="spellStart"/>
+      <w:r>
+        <w:t>front_desk</w:t>
+      </w:r>
+      <w:proofErr w:type="spellEnd"/>
+      <w:r>
+        <w:t xml:space="preserve"> </w:t>
       </w:r>
       <w:r>
         <w:rPr>
@@ -878,7 +1081,23 @@
           <w:b/>
           <w:bCs/>
         </w:rPr>
-        <w:t>HU-605 – Refactor General</w:t>
+        <w:t xml:space="preserve">HU-605 – </w:t>
+      </w:r>
+      <w:proofErr w:type="spellStart"/>
+      <w:r>
+        <w:rPr>
+          <w:b/>
+          <w:bCs/>
+        </w:rPr>
+        <w:t>Refactor</w:t>
+      </w:r>
+      <w:proofErr w:type="spellEnd"/>
+      <w:r>
+        <w:rPr>
+          <w:b/>
+          <w:bCs/>
+        </w:rPr>
+        <w:t xml:space="preserve"> General</w:t>
       </w:r>
     </w:p>
     <w:p>
@@ -1000,7 +1219,15 @@
         </w:numPr>
       </w:pPr>
       <w:r>
-        <w:t>Rol front_desk operativo</w:t>
+        <w:t xml:space="preserve">Rol </w:t>
+      </w:r>
+      <w:proofErr w:type="spellStart"/>
+      <w:r>
+        <w:t>front_desk</w:t>
+      </w:r>
+      <w:proofErr w:type="spellEnd"/>
+      <w:r>
+        <w:t xml:space="preserve"> operativo</w:t>
       </w:r>
     </w:p>
     <w:p>
@@ -1010,8 +1237,13 @@
           <w:numId w:val="9"/>
         </w:numPr>
       </w:pPr>
-      <w:r>
-        <w:t>Refactor aplicado sin romper flujos previos</w:t>
+      <w:proofErr w:type="spellStart"/>
+      <w:r>
+        <w:t>Refactor</w:t>
+      </w:r>
+      <w:proofErr w:type="spellEnd"/>
+      <w:r>
+        <w:t xml:space="preserve"> aplicado sin romper flujos previos</w:t>
       </w:r>
     </w:p>
     <w:p>
@@ -1032,8 +1264,21 @@
           <w:numId w:val="9"/>
         </w:numPr>
       </w:pPr>
-      <w:r>
-        <w:t>Backend y frontend sincronizados</w:t>
+      <w:proofErr w:type="spellStart"/>
+      <w:r>
+        <w:t>Backend</w:t>
+      </w:r>
+      <w:proofErr w:type="spellEnd"/>
+      <w:r>
+        <w:t xml:space="preserve"> y </w:t>
+      </w:r>
+      <w:proofErr w:type="spellStart"/>
+      <w:r>
+        <w:t>frontend</w:t>
+      </w:r>
+      <w:proofErr w:type="spellEnd"/>
+      <w:r>
+        <w:t xml:space="preserve"> sincronizados</w:t>
       </w:r>
     </w:p>
     <w:p>
@@ -1059,7 +1304,23 @@
         </w:numPr>
       </w:pPr>
       <w:r>
-        <w:t>Modelos y endpoints de sprints anteriores</w:t>
+        <w:t xml:space="preserve">Modelos y </w:t>
+      </w:r>
+      <w:proofErr w:type="spellStart"/>
+      <w:r>
+        <w:t>endpoints</w:t>
+      </w:r>
+      <w:proofErr w:type="spellEnd"/>
+      <w:r>
+        <w:t xml:space="preserve"> de </w:t>
+      </w:r>
+      <w:proofErr w:type="spellStart"/>
+      <w:r>
+        <w:t>sprints</w:t>
+      </w:r>
+      <w:proofErr w:type="spellEnd"/>
+      <w:r>
+        <w:t xml:space="preserve"> anteriores</w:t>
       </w:r>
     </w:p>
     <w:p>
@@ -1091,8 +1352,13 @@
           <w:numId w:val="10"/>
         </w:numPr>
       </w:pPr>
-      <w:r>
-        <w:t>Testing inicial del Sprint 5</w:t>
+      <w:proofErr w:type="spellStart"/>
+      <w:r>
+        <w:t>Testing</w:t>
+      </w:r>
+      <w:proofErr w:type="spellEnd"/>
+      <w:r>
+        <w:t xml:space="preserve"> inicial del Sprint 5</w:t>
       </w:r>
     </w:p>
     <w:p>
@@ -1130,7 +1396,23 @@
           <w:b/>
           <w:bCs/>
         </w:rPr>
-        <w:t xml:space="preserve"> Refactor puede romper flujos previos</w:t>
+        <w:t xml:space="preserve"> </w:t>
+      </w:r>
+      <w:proofErr w:type="spellStart"/>
+      <w:r>
+        <w:rPr>
+          <w:b/>
+          <w:bCs/>
+        </w:rPr>
+        <w:t>Refactor</w:t>
+      </w:r>
+      <w:proofErr w:type="spellEnd"/>
+      <w:r>
+        <w:rPr>
+          <w:b/>
+          <w:bCs/>
+        </w:rPr>
+        <w:t xml:space="preserve"> puede romper flujos previos</w:t>
       </w:r>
     </w:p>
     <w:p>
@@ -1186,7 +1468,23 @@
           <w:b/>
           <w:bCs/>
         </w:rPr>
-        <w:t xml:space="preserve"> Rol front_desk requiere permisos específicos</w:t>
+        <w:t xml:space="preserve"> Rol </w:t>
+      </w:r>
+      <w:proofErr w:type="spellStart"/>
+      <w:r>
+        <w:rPr>
+          <w:b/>
+          <w:bCs/>
+        </w:rPr>
+        <w:t>front_desk</w:t>
+      </w:r>
+      <w:proofErr w:type="spellEnd"/>
+      <w:r>
+        <w:rPr>
+          <w:b/>
+          <w:bCs/>
+        </w:rPr>
+        <w:t xml:space="preserve"> requiere permisos específicos</w:t>
       </w:r>
     </w:p>
     <w:p>
@@ -1415,8 +1713,17 @@
                 <w:b/>
                 <w:bCs/>
               </w:rPr>
-              <w:t>Rol front_desk</w:t>
+              <w:t xml:space="preserve">Rol </w:t>
             </w:r>
+            <w:proofErr w:type="spellStart"/>
+            <w:r>
+              <w:rPr>
+                <w:b/>
+                <w:bCs/>
+              </w:rPr>
+              <w:t>front_desk</w:t>
+            </w:r>
+            <w:proofErr w:type="spellEnd"/>
           </w:p>
         </w:tc>
         <w:tc>
@@ -1449,6 +1756,7 @@
                 <w:bCs/>
               </w:rPr>
             </w:pPr>
+            <w:proofErr w:type="spellStart"/>
             <w:r>
               <w:rPr>
                 <w:b/>
@@ -1456,6 +1764,7 @@
               </w:rPr>
               <w:t>Refactor</w:t>
             </w:r>
+            <w:proofErr w:type="spellEnd"/>
           </w:p>
         </w:tc>
         <w:tc>
@@ -1528,8 +1837,13 @@
         </w:numPr>
       </w:pPr>
       <w:r>
-        <w:t>Rol front_desk</w:t>
-      </w:r>
+        <w:t xml:space="preserve">Rol </w:t>
+      </w:r>
+      <w:proofErr w:type="spellStart"/>
+      <w:r>
+        <w:t>front_desk</w:t>
+      </w:r>
+      <w:proofErr w:type="spellEnd"/>
     </w:p>
     <w:p>
       <w:pPr>
@@ -1538,8 +1852,13 @@
           <w:numId w:val="11"/>
         </w:numPr>
       </w:pPr>
-      <w:r>
-        <w:t>Refactor general</w:t>
+      <w:proofErr w:type="spellStart"/>
+      <w:r>
+        <w:t>Refactor</w:t>
+      </w:r>
+      <w:proofErr w:type="spellEnd"/>
+      <w:r>
+        <w:t xml:space="preserve"> general</w:t>
       </w:r>
     </w:p>
     <w:p>
@@ -1608,6 +1927,45 @@
       </w:r>
       <w:r>
         <w:t xml:space="preserve"> Crítico para MVP</w:t>
+      </w:r>
+    </w:p>
+    <w:p>
+      <w:r>
+        <w:rPr>
+          <w:rFonts w:ascii="Segoe UI Emoji" w:hAnsi="Segoe UI Emoji" w:cs="Segoe UI Emoji"/>
+        </w:rPr>
+        <w:t>🟩</w:t>
+      </w:r>
+      <w:r>
+        <w:t xml:space="preserve"> Estado final del Sprint 6</w:t>
+      </w:r>
+    </w:p>
+    <w:p>
+      <w:proofErr w:type="spellStart"/>
+      <w:r>
+        <w:t>Backend</w:t>
+      </w:r>
+      <w:proofErr w:type="spellEnd"/>
+      <w:r>
+        <w:t xml:space="preserve"> completo y estable.</w:t>
+      </w:r>
+    </w:p>
+    <w:p>
+      <w:r>
+        <w:t xml:space="preserve">CRUD de clases desde </w:t>
+      </w:r>
+      <w:proofErr w:type="spellStart"/>
+      <w:r>
+        <w:t>frontend</w:t>
+      </w:r>
+      <w:proofErr w:type="spellEnd"/>
+      <w:r>
+        <w:t xml:space="preserve"> en desarrollo.</w:t>
+      </w:r>
+    </w:p>
+    <w:p>
+      <w:r>
+        <w:t>Preparación para Sprint 7 – MVP Operativo.</w:t>
       </w:r>
     </w:p>
     <w:p/>

</xml_diff>